<commit_message>
make application use SQL Server repositories
</commit_message>
<xml_diff>
--- a/docs/testing/testing-template-filled.docx
+++ b/docs/testing/testing-template-filled.docx
@@ -4,14 +4,30 @@
   <w:body>
     <w:p>
       <w:r>
-        <w:t>Filled testing template</w:t>
+        <w:t xml:space="preserve">Testing template - materials</w:t>
       </w:r>
     </w:p>
     <w:p>
       <w:r>
-        <w:t>Final exam documentation. See markdown files for full content.</w:t>
+        <w:t xml:space="preserve">Database setup: setup-db.ps1 creates SQL Server schema and seed data.</w:t>
       </w:r>
     </w:p>
+    <w:p>
+      <w:r>
+        <w:t xml:space="preserve">Functional checks: 15 records per page, search, sort, filter, combined operations, counter.</w:t>
+      </w:r>
+    </w:p>
+    <w:p>
+      <w:r>
+        <w:t xml:space="preserve">Business checks: stock highlighting, required purchase cost, supplier links, bulk min count update, dependency-aware delete.</w:t>
+      </w:r>
+    </w:p>
+    <w:p>
+      <w:r>
+        <w:t xml:space="preserve">Result: application uses SQL Server through ADO.NET repositories.</w:t>
+      </w:r>
+    </w:p>
+    <w:sectPr/>
   </w:body>
 </w:document>
 </file>
</xml_diff>